<commit_message>
Agregar practicas 06-09, tareas y scripts generadores
</commit_message>
<xml_diff>
--- a/practica02-iam-minimo-privilegio.docx
+++ b/practica02-iam-minimo-privilegio.docx
@@ -27,7 +27,7 @@
           <w:sz w:val="24"/>
           <w:szCs w:val="24"/>
         </w:rPr>
-        <w:t xml:space="preserve">Cómputo en la Nube · Grupo 501</w:t>
+        <w:t xml:space="preserve">Cómputo en la Nube · Grupo 503</w:t>
       </w:r>
     </w:p>
     <w:p>
@@ -968,7 +968,7 @@
                 <w:sz w:val="20"/>
                 <w:szCs w:val="20"/>
               </w:rPr>
-              <w:t xml:space="preserve">No restringe por recurso ni por servicio específico</w:t>
+              <w:t xml:space="preserve">No restringe por recurso ni por servicio específico → reemplazada por pol-arquitectura-losrojos</w:t>
             </w:r>
           </w:p>
         </w:tc>
@@ -1859,6 +1859,661 @@
           <w:szCs w:val="18"/>
         </w:rPr>
         <w:t xml:space="preserve">      "Resource": "arn:aws:logs:us-east-1:*:log-group:/aws/*"</w:t>
+      </w:r>
+    </w:p>
+    <w:p>
+      <w:pPr>
+        <w:spacing w:after="0" w:before="0"/>
+        <w:ind w:left="360"/>
+      </w:pPr>
+      <w:r>
+        <w:rPr>
+          <w:rFonts w:ascii="Courier New" w:cs="Courier New" w:eastAsia="Courier New" w:hAnsi="Courier New"/>
+          <w:sz w:val="18"/>
+          <w:szCs w:val="18"/>
+        </w:rPr>
+        <w:t xml:space="preserve">    }</w:t>
+      </w:r>
+    </w:p>
+    <w:p>
+      <w:pPr>
+        <w:spacing w:after="0" w:before="0"/>
+        <w:ind w:left="360"/>
+      </w:pPr>
+      <w:r>
+        <w:rPr>
+          <w:rFonts w:ascii="Courier New" w:cs="Courier New" w:eastAsia="Courier New" w:hAnsi="Courier New"/>
+          <w:sz w:val="18"/>
+          <w:szCs w:val="18"/>
+        </w:rPr>
+        <w:t xml:space="preserve">  ]</w:t>
+      </w:r>
+    </w:p>
+    <w:p>
+      <w:pPr>
+        <w:spacing w:after="0" w:before="0"/>
+        <w:ind w:left="360"/>
+      </w:pPr>
+      <w:r>
+        <w:rPr>
+          <w:rFonts w:ascii="Courier New" w:cs="Courier New" w:eastAsia="Courier New" w:hAnsi="Courier New"/>
+          <w:sz w:val="18"/>
+          <w:szCs w:val="18"/>
+        </w:rPr>
+        <w:t xml:space="preserve">}</w:t>
+      </w:r>
+    </w:p>
+    <w:p>
+      <w:pPr>
+        <w:spacing w:after="80" w:before="80"/>
+      </w:pPr>
+    </w:p>
+    <w:p>
+      <w:pPr>
+        <w:pStyle w:val="Heading1"/>
+        <w:spacing w:after="120" w:before="300"/>
+      </w:pPr>
+      <w:r>
+        <w:rPr>
+          <w:b/>
+          <w:bCs/>
+          <w:sz w:val="28"/>
+          <w:szCs w:val="28"/>
+        </w:rPr>
+        <w:t xml:space="preserve">3b. Política de Arquitectura — Descripción de Red e Infraestructura</w:t>
+      </w:r>
+    </w:p>
+    <w:p>
+      <w:pPr>
+        <w:spacing w:after="60" w:before="60"/>
+      </w:pPr>
+      <w:r>
+        <w:rPr>
+          <w:b/>
+          <w:bCs/>
+          <w:sz w:val="22"/>
+          <w:szCs w:val="22"/>
+        </w:rPr>
+        <w:t xml:space="preserve">Nombre: </w:t>
+      </w:r>
+      <w:r>
+        <w:rPr>
+          <w:b w:val="false"/>
+          <w:bCs w:val="false"/>
+          <w:sz w:val="22"/>
+          <w:szCs w:val="22"/>
+        </w:rPr>
+        <w:t xml:space="preserve">pol-arquitectura-losrojos</w:t>
+      </w:r>
+    </w:p>
+    <w:p>
+      <w:pPr>
+        <w:spacing w:after="60" w:before="60"/>
+      </w:pPr>
+      <w:r>
+        <w:rPr>
+          <w:b/>
+          <w:bCs/>
+          <w:sz w:val="22"/>
+          <w:szCs w:val="22"/>
+        </w:rPr>
+        <w:t xml:space="preserve">Asignada a: </w:t>
+      </w:r>
+      <w:r>
+        <w:rPr>
+          <w:b w:val="false"/>
+          <w:bCs w:val="false"/>
+          <w:sz w:val="22"/>
+          <w:szCs w:val="22"/>
+        </w:rPr>
+        <w:t xml:space="preserve">grp-arquitectura (usr-kevin)</w:t>
+      </w:r>
+    </w:p>
+    <w:p>
+      <w:pPr>
+        <w:spacing w:after="80" w:before="80"/>
+      </w:pPr>
+    </w:p>
+    <w:p>
+      <w:pPr>
+        <w:spacing w:after="60" w:before="60"/>
+      </w:pPr>
+      <w:r>
+        <w:rPr>
+          <w:sz w:val="22"/>
+          <w:szCs w:val="22"/>
+        </w:rPr>
+        <w:t xml:space="preserve">¿Qué permite esta política?</w:t>
+      </w:r>
+    </w:p>
+    <w:p>
+      <w:pPr>
+        <w:pStyle w:val="ListParagraph"/>
+        <w:numPr>
+          <w:ilvl w:val="0"/>
+          <w:numId w:val="1"/>
+        </w:numPr>
+        <w:spacing w:after="40" w:before="40"/>
+      </w:pPr>
+      <w:r>
+        <w:rPr>
+          <w:sz w:val="22"/>
+          <w:szCs w:val="22"/>
+        </w:rPr>
+        <w:t xml:space="preserve">ec2:DescribeVpcs, ec2:DescribeSubnets — Ver la topología de red del proyecto</w:t>
+      </w:r>
+    </w:p>
+    <w:p>
+      <w:pPr>
+        <w:pStyle w:val="ListParagraph"/>
+        <w:numPr>
+          <w:ilvl w:val="0"/>
+          <w:numId w:val="1"/>
+        </w:numPr>
+        <w:spacing w:after="40" w:before="40"/>
+      </w:pPr>
+      <w:r>
+        <w:rPr>
+          <w:sz w:val="22"/>
+          <w:szCs w:val="22"/>
+        </w:rPr>
+        <w:t xml:space="preserve">ec2:DescribeSecurityGroups, ec2:DescribeSecurityGroupRules — Inspeccionar reglas de firewall</w:t>
+      </w:r>
+    </w:p>
+    <w:p>
+      <w:pPr>
+        <w:pStyle w:val="ListParagraph"/>
+        <w:numPr>
+          <w:ilvl w:val="0"/>
+          <w:numId w:val="1"/>
+        </w:numPr>
+        <w:spacing w:after="40" w:before="40"/>
+      </w:pPr>
+      <w:r>
+        <w:rPr>
+          <w:sz w:val="22"/>
+          <w:szCs w:val="22"/>
+        </w:rPr>
+        <w:t xml:space="preserve">ec2:DescribeRouteTables, ec2:DescribeInternetGateways, ec2:DescribeNatGateways — Analizar el enrutamiento</w:t>
+      </w:r>
+    </w:p>
+    <w:p>
+      <w:pPr>
+        <w:pStyle w:val="ListParagraph"/>
+        <w:numPr>
+          <w:ilvl w:val="0"/>
+          <w:numId w:val="1"/>
+        </w:numPr>
+        <w:spacing w:after="40" w:before="40"/>
+      </w:pPr>
+      <w:r>
+        <w:rPr>
+          <w:sz w:val="22"/>
+          <w:szCs w:val="22"/>
+        </w:rPr>
+        <w:t xml:space="preserve">elasticloadbalancing:Describe* — Revisar load balancers, target groups y listeners</w:t>
+      </w:r>
+    </w:p>
+    <w:p>
+      <w:pPr>
+        <w:pStyle w:val="ListParagraph"/>
+        <w:numPr>
+          <w:ilvl w:val="0"/>
+          <w:numId w:val="1"/>
+        </w:numPr>
+        <w:spacing w:after="40" w:before="40"/>
+      </w:pPr>
+      <w:r>
+        <w:rPr>
+          <w:sz w:val="22"/>
+          <w:szCs w:val="22"/>
+        </w:rPr>
+        <w:t xml:space="preserve">rds:DescribeDBInstances, rds:DescribeDBSubnetGroups — Ver la base de datos y su red</w:t>
+      </w:r>
+    </w:p>
+    <w:p>
+      <w:pPr>
+        <w:spacing w:after="80" w:before="80"/>
+      </w:pPr>
+    </w:p>
+    <w:p>
+      <w:pPr>
+        <w:spacing w:after="60" w:before="60"/>
+      </w:pPr>
+      <w:r>
+        <w:rPr>
+          <w:sz w:val="22"/>
+          <w:szCs w:val="22"/>
+        </w:rPr>
+        <w:t xml:space="preserve">Restricción clave: todas las acciones están condicionadas a la etiqueta aws:ResourceTag/equipo=los-rojos. Recursos de otros equipos son inaccesibles.</w:t>
+      </w:r>
+    </w:p>
+    <w:p>
+      <w:pPr>
+        <w:spacing w:after="80" w:before="80"/>
+      </w:pPr>
+    </w:p>
+    <w:p>
+      <w:pPr>
+        <w:spacing w:after="60" w:before="60"/>
+      </w:pPr>
+      <w:r>
+        <w:rPr>
+          <w:sz w:val="22"/>
+          <w:szCs w:val="22"/>
+        </w:rPr>
+        <w:t xml:space="preserve">Texto de la política (formato JSON):</w:t>
+      </w:r>
+    </w:p>
+    <w:p>
+      <w:pPr>
+        <w:spacing w:after="80" w:before="80"/>
+      </w:pPr>
+    </w:p>
+    <w:p>
+      <w:pPr>
+        <w:spacing w:after="0" w:before="0"/>
+        <w:ind w:left="360"/>
+      </w:pPr>
+      <w:r>
+        <w:rPr>
+          <w:rFonts w:ascii="Courier New" w:cs="Courier New" w:eastAsia="Courier New" w:hAnsi="Courier New"/>
+          <w:sz w:val="18"/>
+          <w:szCs w:val="18"/>
+        </w:rPr>
+        <w:t xml:space="preserve">{</w:t>
+      </w:r>
+    </w:p>
+    <w:p>
+      <w:pPr>
+        <w:spacing w:after="0" w:before="0"/>
+        <w:ind w:left="360"/>
+      </w:pPr>
+      <w:r>
+        <w:rPr>
+          <w:rFonts w:ascii="Courier New" w:cs="Courier New" w:eastAsia="Courier New" w:hAnsi="Courier New"/>
+          <w:sz w:val="18"/>
+          <w:szCs w:val="18"/>
+        </w:rPr>
+        <w:t xml:space="preserve">  "Version": "2012-10-17",</w:t>
+      </w:r>
+    </w:p>
+    <w:p>
+      <w:pPr>
+        <w:spacing w:after="0" w:before="0"/>
+        <w:ind w:left="360"/>
+      </w:pPr>
+      <w:r>
+        <w:rPr>
+          <w:rFonts w:ascii="Courier New" w:cs="Courier New" w:eastAsia="Courier New" w:hAnsi="Courier New"/>
+          <w:sz w:val="18"/>
+          <w:szCs w:val="18"/>
+        </w:rPr>
+        <w:t xml:space="preserve">  "Statement": [</w:t>
+      </w:r>
+    </w:p>
+    <w:p>
+      <w:pPr>
+        <w:spacing w:after="0" w:before="0"/>
+        <w:ind w:left="360"/>
+      </w:pPr>
+      <w:r>
+        <w:rPr>
+          <w:rFonts w:ascii="Courier New" w:cs="Courier New" w:eastAsia="Courier New" w:hAnsi="Courier New"/>
+          <w:sz w:val="18"/>
+          <w:szCs w:val="18"/>
+        </w:rPr>
+        <w:t xml:space="preserve">    {</w:t>
+      </w:r>
+    </w:p>
+    <w:p>
+      <w:pPr>
+        <w:spacing w:after="0" w:before="0"/>
+        <w:ind w:left="360"/>
+      </w:pPr>
+      <w:r>
+        <w:rPr>
+          <w:rFonts w:ascii="Courier New" w:cs="Courier New" w:eastAsia="Courier New" w:hAnsi="Courier New"/>
+          <w:sz w:val="18"/>
+          <w:szCs w:val="18"/>
+        </w:rPr>
+        <w:t xml:space="preserve">      "Sid": "DescribirRedEInfraestructura",</w:t>
+      </w:r>
+    </w:p>
+    <w:p>
+      <w:pPr>
+        <w:spacing w:after="0" w:before="0"/>
+        <w:ind w:left="360"/>
+      </w:pPr>
+      <w:r>
+        <w:rPr>
+          <w:rFonts w:ascii="Courier New" w:cs="Courier New" w:eastAsia="Courier New" w:hAnsi="Courier New"/>
+          <w:sz w:val="18"/>
+          <w:szCs w:val="18"/>
+        </w:rPr>
+        <w:t xml:space="preserve">      "Effect": "Allow",</w:t>
+      </w:r>
+    </w:p>
+    <w:p>
+      <w:pPr>
+        <w:spacing w:after="0" w:before="0"/>
+        <w:ind w:left="360"/>
+      </w:pPr>
+      <w:r>
+        <w:rPr>
+          <w:rFonts w:ascii="Courier New" w:cs="Courier New" w:eastAsia="Courier New" w:hAnsi="Courier New"/>
+          <w:sz w:val="18"/>
+          <w:szCs w:val="18"/>
+        </w:rPr>
+        <w:t xml:space="preserve">      "Action": [</w:t>
+      </w:r>
+    </w:p>
+    <w:p>
+      <w:pPr>
+        <w:spacing w:after="0" w:before="0"/>
+        <w:ind w:left="360"/>
+      </w:pPr>
+      <w:r>
+        <w:rPr>
+          <w:rFonts w:ascii="Courier New" w:cs="Courier New" w:eastAsia="Courier New" w:hAnsi="Courier New"/>
+          <w:sz w:val="18"/>
+          <w:szCs w:val="18"/>
+        </w:rPr>
+        <w:t xml:space="preserve">        "ec2:DescribeInstances",</w:t>
+      </w:r>
+    </w:p>
+    <w:p>
+      <w:pPr>
+        <w:spacing w:after="0" w:before="0"/>
+        <w:ind w:left="360"/>
+      </w:pPr>
+      <w:r>
+        <w:rPr>
+          <w:rFonts w:ascii="Courier New" w:cs="Courier New" w:eastAsia="Courier New" w:hAnsi="Courier New"/>
+          <w:sz w:val="18"/>
+          <w:szCs w:val="18"/>
+        </w:rPr>
+        <w:t xml:space="preserve">        "ec2:DescribeVpcs",</w:t>
+      </w:r>
+    </w:p>
+    <w:p>
+      <w:pPr>
+        <w:spacing w:after="0" w:before="0"/>
+        <w:ind w:left="360"/>
+      </w:pPr>
+      <w:r>
+        <w:rPr>
+          <w:rFonts w:ascii="Courier New" w:cs="Courier New" w:eastAsia="Courier New" w:hAnsi="Courier New"/>
+          <w:sz w:val="18"/>
+          <w:szCs w:val="18"/>
+        </w:rPr>
+        <w:t xml:space="preserve">        "ec2:DescribeSubnets",</w:t>
+      </w:r>
+    </w:p>
+    <w:p>
+      <w:pPr>
+        <w:spacing w:after="0" w:before="0"/>
+        <w:ind w:left="360"/>
+      </w:pPr>
+      <w:r>
+        <w:rPr>
+          <w:rFonts w:ascii="Courier New" w:cs="Courier New" w:eastAsia="Courier New" w:hAnsi="Courier New"/>
+          <w:sz w:val="18"/>
+          <w:szCs w:val="18"/>
+        </w:rPr>
+        <w:t xml:space="preserve">        "ec2:DescribeSecurityGroups",</w:t>
+      </w:r>
+    </w:p>
+    <w:p>
+      <w:pPr>
+        <w:spacing w:after="0" w:before="0"/>
+        <w:ind w:left="360"/>
+      </w:pPr>
+      <w:r>
+        <w:rPr>
+          <w:rFonts w:ascii="Courier New" w:cs="Courier New" w:eastAsia="Courier New" w:hAnsi="Courier New"/>
+          <w:sz w:val="18"/>
+          <w:szCs w:val="18"/>
+        </w:rPr>
+        <w:t xml:space="preserve">        "ec2:DescribeSecurityGroupRules",</w:t>
+      </w:r>
+    </w:p>
+    <w:p>
+      <w:pPr>
+        <w:spacing w:after="0" w:before="0"/>
+        <w:ind w:left="360"/>
+      </w:pPr>
+      <w:r>
+        <w:rPr>
+          <w:rFonts w:ascii="Courier New" w:cs="Courier New" w:eastAsia="Courier New" w:hAnsi="Courier New"/>
+          <w:sz w:val="18"/>
+          <w:szCs w:val="18"/>
+        </w:rPr>
+        <w:t xml:space="preserve">        "ec2:DescribeRouteTables",</w:t>
+      </w:r>
+    </w:p>
+    <w:p>
+      <w:pPr>
+        <w:spacing w:after="0" w:before="0"/>
+        <w:ind w:left="360"/>
+      </w:pPr>
+      <w:r>
+        <w:rPr>
+          <w:rFonts w:ascii="Courier New" w:cs="Courier New" w:eastAsia="Courier New" w:hAnsi="Courier New"/>
+          <w:sz w:val="18"/>
+          <w:szCs w:val="18"/>
+        </w:rPr>
+        <w:t xml:space="preserve">        "ec2:DescribeInternetGateways",</w:t>
+      </w:r>
+    </w:p>
+    <w:p>
+      <w:pPr>
+        <w:spacing w:after="0" w:before="0"/>
+        <w:ind w:left="360"/>
+      </w:pPr>
+      <w:r>
+        <w:rPr>
+          <w:rFonts w:ascii="Courier New" w:cs="Courier New" w:eastAsia="Courier New" w:hAnsi="Courier New"/>
+          <w:sz w:val="18"/>
+          <w:szCs w:val="18"/>
+        </w:rPr>
+        <w:t xml:space="preserve">        "ec2:DescribeNatGateways",</w:t>
+      </w:r>
+    </w:p>
+    <w:p>
+      <w:pPr>
+        <w:spacing w:after="0" w:before="0"/>
+        <w:ind w:left="360"/>
+      </w:pPr>
+      <w:r>
+        <w:rPr>
+          <w:rFonts w:ascii="Courier New" w:cs="Courier New" w:eastAsia="Courier New" w:hAnsi="Courier New"/>
+          <w:sz w:val="18"/>
+          <w:szCs w:val="18"/>
+        </w:rPr>
+        <w:t xml:space="preserve">        "ec2:DescribeTags",</w:t>
+      </w:r>
+    </w:p>
+    <w:p>
+      <w:pPr>
+        <w:spacing w:after="0" w:before="0"/>
+        <w:ind w:left="360"/>
+      </w:pPr>
+      <w:r>
+        <w:rPr>
+          <w:rFonts w:ascii="Courier New" w:cs="Courier New" w:eastAsia="Courier New" w:hAnsi="Courier New"/>
+          <w:sz w:val="18"/>
+          <w:szCs w:val="18"/>
+        </w:rPr>
+        <w:t xml:space="preserve">        "elasticloadbalancing:DescribeLoadBalancers",</w:t>
+      </w:r>
+    </w:p>
+    <w:p>
+      <w:pPr>
+        <w:spacing w:after="0" w:before="0"/>
+        <w:ind w:left="360"/>
+      </w:pPr>
+      <w:r>
+        <w:rPr>
+          <w:rFonts w:ascii="Courier New" w:cs="Courier New" w:eastAsia="Courier New" w:hAnsi="Courier New"/>
+          <w:sz w:val="18"/>
+          <w:szCs w:val="18"/>
+        </w:rPr>
+        <w:t xml:space="preserve">        "elasticloadbalancing:DescribeTargetGroups",</w:t>
+      </w:r>
+    </w:p>
+    <w:p>
+      <w:pPr>
+        <w:spacing w:after="0" w:before="0"/>
+        <w:ind w:left="360"/>
+      </w:pPr>
+      <w:r>
+        <w:rPr>
+          <w:rFonts w:ascii="Courier New" w:cs="Courier New" w:eastAsia="Courier New" w:hAnsi="Courier New"/>
+          <w:sz w:val="18"/>
+          <w:szCs w:val="18"/>
+        </w:rPr>
+        <w:t xml:space="preserve">        "elasticloadbalancing:DescribeListeners",</w:t>
+      </w:r>
+    </w:p>
+    <w:p>
+      <w:pPr>
+        <w:spacing w:after="0" w:before="0"/>
+        <w:ind w:left="360"/>
+      </w:pPr>
+      <w:r>
+        <w:rPr>
+          <w:rFonts w:ascii="Courier New" w:cs="Courier New" w:eastAsia="Courier New" w:hAnsi="Courier New"/>
+          <w:sz w:val="18"/>
+          <w:szCs w:val="18"/>
+        </w:rPr>
+        <w:t xml:space="preserve">        "rds:DescribeDBInstances",</w:t>
+      </w:r>
+    </w:p>
+    <w:p>
+      <w:pPr>
+        <w:spacing w:after="0" w:before="0"/>
+        <w:ind w:left="360"/>
+      </w:pPr>
+      <w:r>
+        <w:rPr>
+          <w:rFonts w:ascii="Courier New" w:cs="Courier New" w:eastAsia="Courier New" w:hAnsi="Courier New"/>
+          <w:sz w:val="18"/>
+          <w:szCs w:val="18"/>
+        </w:rPr>
+        <w:t xml:space="preserve">        "rds:DescribeDBSubnetGroups",</w:t>
+      </w:r>
+    </w:p>
+    <w:p>
+      <w:pPr>
+        <w:spacing w:after="0" w:before="0"/>
+        <w:ind w:left="360"/>
+      </w:pPr>
+      <w:r>
+        <w:rPr>
+          <w:rFonts w:ascii="Courier New" w:cs="Courier New" w:eastAsia="Courier New" w:hAnsi="Courier New"/>
+          <w:sz w:val="18"/>
+          <w:szCs w:val="18"/>
+        </w:rPr>
+        <w:t xml:space="preserve">        "rds:ListTagsForResource"</w:t>
+      </w:r>
+    </w:p>
+    <w:p>
+      <w:pPr>
+        <w:spacing w:after="0" w:before="0"/>
+        <w:ind w:left="360"/>
+      </w:pPr>
+      <w:r>
+        <w:rPr>
+          <w:rFonts w:ascii="Courier New" w:cs="Courier New" w:eastAsia="Courier New" w:hAnsi="Courier New"/>
+          <w:sz w:val="18"/>
+          <w:szCs w:val="18"/>
+        </w:rPr>
+        <w:t xml:space="preserve">      ],</w:t>
+      </w:r>
+    </w:p>
+    <w:p>
+      <w:pPr>
+        <w:spacing w:after="0" w:before="0"/>
+        <w:ind w:left="360"/>
+      </w:pPr>
+      <w:r>
+        <w:rPr>
+          <w:rFonts w:ascii="Courier New" w:cs="Courier New" w:eastAsia="Courier New" w:hAnsi="Courier New"/>
+          <w:sz w:val="18"/>
+          <w:szCs w:val="18"/>
+        </w:rPr>
+        <w:t xml:space="preserve">      "Resource": "*",</w:t>
+      </w:r>
+    </w:p>
+    <w:p>
+      <w:pPr>
+        <w:spacing w:after="0" w:before="0"/>
+        <w:ind w:left="360"/>
+      </w:pPr>
+      <w:r>
+        <w:rPr>
+          <w:rFonts w:ascii="Courier New" w:cs="Courier New" w:eastAsia="Courier New" w:hAnsi="Courier New"/>
+          <w:sz w:val="18"/>
+          <w:szCs w:val="18"/>
+        </w:rPr>
+        <w:t xml:space="preserve">      "Condition": {</w:t>
+      </w:r>
+    </w:p>
+    <w:p>
+      <w:pPr>
+        <w:spacing w:after="0" w:before="0"/>
+        <w:ind w:left="360"/>
+      </w:pPr>
+      <w:r>
+        <w:rPr>
+          <w:rFonts w:ascii="Courier New" w:cs="Courier New" w:eastAsia="Courier New" w:hAnsi="Courier New"/>
+          <w:sz w:val="18"/>
+          <w:szCs w:val="18"/>
+        </w:rPr>
+        <w:t xml:space="preserve">        "StringEquals": {</w:t>
+      </w:r>
+    </w:p>
+    <w:p>
+      <w:pPr>
+        <w:spacing w:after="0" w:before="0"/>
+        <w:ind w:left="360"/>
+      </w:pPr>
+      <w:r>
+        <w:rPr>
+          <w:rFonts w:ascii="Courier New" w:cs="Courier New" w:eastAsia="Courier New" w:hAnsi="Courier New"/>
+          <w:sz w:val="18"/>
+          <w:szCs w:val="18"/>
+        </w:rPr>
+        <w:t xml:space="preserve">          "aws:ResourceTag/equipo": "los-rojos"</w:t>
+      </w:r>
+    </w:p>
+    <w:p>
+      <w:pPr>
+        <w:spacing w:after="0" w:before="0"/>
+        <w:ind w:left="360"/>
+      </w:pPr>
+      <w:r>
+        <w:rPr>
+          <w:rFonts w:ascii="Courier New" w:cs="Courier New" w:eastAsia="Courier New" w:hAnsi="Courier New"/>
+          <w:sz w:val="18"/>
+          <w:szCs w:val="18"/>
+        </w:rPr>
+        <w:t xml:space="preserve">        }</w:t>
+      </w:r>
+    </w:p>
+    <w:p>
+      <w:pPr>
+        <w:spacing w:after="0" w:before="0"/>
+        <w:ind w:left="360"/>
+      </w:pPr>
+      <w:r>
+        <w:rPr>
+          <w:rFonts w:ascii="Courier New" w:cs="Courier New" w:eastAsia="Courier New" w:hAnsi="Courier New"/>
+          <w:sz w:val="18"/>
+          <w:szCs w:val="18"/>
+        </w:rPr>
+        <w:t xml:space="preserve">      }</w:t>
       </w:r>
     </w:p>
     <w:p>
@@ -4061,7 +4716,7 @@
                 <w:sz w:val="20"/>
                 <w:szCs w:val="20"/>
               </w:rPr>
-              <w:t xml:space="preserve">Sin política aún (práctica 3)</w:t>
+              <w:t xml:space="preserve">pol-arquitectura-losrojos</w:t>
             </w:r>
           </w:p>
         </w:tc>
@@ -4086,7 +4741,7 @@
                 <w:sz w:val="20"/>
                 <w:szCs w:val="20"/>
               </w:rPr>
-              <w:t xml:space="preserve">—</w:t>
+              <w:t xml:space="preserve">ec2:Describe* (VPC, Subnets, SG, ELB), rds:DescribeDBInstances</w:t>
             </w:r>
           </w:p>
         </w:tc>
@@ -4111,7 +4766,7 @@
                 <w:sz w:val="20"/>
                 <w:szCs w:val="20"/>
               </w:rPr>
-              <w:t xml:space="preserve">—</w:t>
+              <w:t xml:space="preserve">Solo recursos con etiqueta equipo=los-rojos</w:t>
             </w:r>
           </w:p>
         </w:tc>

</xml_diff>